<commit_message>
Add five system-level recommendations (waste-picker integration, temporal separation, enforcement on the mixing actor, wet-waste diversion, realistic targets); drop R-numbering
</commit_message>
<xml_diff>
--- a/Waste-Management-Field-Project-Pranjal-Yadav-UPDATED.docx
+++ b/Waste-Management-Field-Project-Pranjal-Yadav-UPDATED.docx
@@ -10219,6 +10219,18 @@
       </w:r>
     </w:p>
     <w:p>
+      <w:pPr/>
+      <w:r>
+        <w:t>The binding constraint is institutional rather than informational. The Solid Waste Management Rules, 2016 have mandated three-stream segregation, user fees, spot fines and the integration of waste pickers for eight years, yet the Comptroller and Auditor General's 2024 audit of 102 urban local bodies found only 3.13 per cent of collected waste was segregated, and in 11 of 13 test-checked bodies waste pickers were neither recognised nor registered. The party missing from most implementation plans is the informal recovery sector, which this study observed within 100 metres of the Zone C collection point but did not treat as a participant in the system.</w:t>
+      </w:r>
+    </w:p>
+    <w:p>
+      <w:pPr/>
+      <w:r>
+        <w:t>Tonnage arithmetic further reframes the problem. Wet waste exceeds half of urban municipal solid waste, while dry recyclables are only 5 to 15 per cent by mass, so segregation alone cannot reduce the dominant flow. Measured interventions must therefore combine segregation at source with the diversion of wet waste at or near the point of generation, and must be designed around the recovery sector rather than around household persuasion.</w:t>
+      </w:r>
+    </w:p>
+    <w:p>
       <w:pPr>
         <w:pStyle w:val="Heading2"/>
         <w:rPr/>
@@ -10252,7 +10264,6 @@
           <w:bCs w:val="1"/>
           <w:rtl w:val="0"/>
         </w:rPr>
-        <w:t xml:space="preserve">R1: </w:t>
       </w:r>
       <w:r>
         <w:rPr>
@@ -10276,7 +10287,6 @@
           <w:bCs w:val="1"/>
           <w:rtl w:val="0"/>
         </w:rPr>
-        <w:t xml:space="preserve">R2: </w:t>
       </w:r>
       <w:r>
         <w:rPr>
@@ -10300,7 +10310,6 @@
           <w:bCs w:val="1"/>
           <w:rtl w:val="0"/>
         </w:rPr>
-        <w:t xml:space="preserve">R3: </w:t>
       </w:r>
       <w:r>
         <w:rPr>
@@ -10324,7 +10333,6 @@
           <w:bCs w:val="1"/>
           <w:rtl w:val="0"/>
         </w:rPr>
-        <w:t xml:space="preserve">R4: </w:t>
       </w:r>
       <w:r>
         <w:rPr>
@@ -10348,7 +10356,6 @@
           <w:bCs w:val="1"/>
           <w:rtl w:val="0"/>
         </w:rPr>
-        <w:t xml:space="preserve">R5: </w:t>
       </w:r>
       <w:r>
         <w:rPr>
@@ -10372,7 +10379,6 @@
           <w:bCs w:val="1"/>
           <w:rtl w:val="0"/>
         </w:rPr>
-        <w:t xml:space="preserve">R6: </w:t>
       </w:r>
       <w:r>
         <w:rPr>
@@ -10396,7 +10402,6 @@
           <w:bCs w:val="1"/>
           <w:rtl w:val="0"/>
         </w:rPr>
-        <w:t xml:space="preserve">R7: </w:t>
       </w:r>
       <w:r>
         <w:rPr>
@@ -10420,7 +10425,6 @@
           <w:bCs w:val="1"/>
           <w:rtl w:val="0"/>
         </w:rPr>
-        <w:t xml:space="preserve">R8: </w:t>
       </w:r>
       <w:r>
         <w:rPr>
@@ -10444,13 +10448,42 @@
           <w:bCs w:val="1"/>
           <w:rtl w:val="0"/>
         </w:rPr>
-        <w:t xml:space="preserve">R9: </w:t>
       </w:r>
       <w:r>
         <w:rPr>
           <w:rtl w:val="0"/>
         </w:rPr>
         <w:t xml:space="preserve">Placed permanent bilingual (Marathi/Hindi) sorting labels on residential collection bins and monitored overflow and contamination rates over a 3-day observational window. (Owner: Student initiative: track 3-day bin contamination)</w:t>
+      </w:r>
+    </w:p>
+    <w:p>
+      <w:pPr/>
+      <w:r>
+        <w:t>Integrate and formalise waste pickers and kabadiwalas. Identify and register waste pickers in the ward, issue identity cards, pay for recovered material by weight at market rate, provide segregated collection vehicles including twin-bin tricycles, and convert existing dhalaos into neighbourhood recycling centres. Every documented city-scale success reviewed for this study - Vengurla, Kumbakonam, Leh and the Delhi SDMC model - combines segregation with formalised informal-sector participation; bins and awareness alone have not produced 100 per cent segregation anywhere. (Owner: ULB with the SWM cell and registered self-help groups: count registered pickers and kilograms purchased per month)</w:t>
+      </w:r>
+    </w:p>
+    <w:p>
+      <w:pPr/>
+      <w:r>
+        <w:t>Separate streams in time where vehicles cannot be compartmentalised. Until compartmentalised vehicles are available, schedule wet waste daily in the morning and dry recyclables on fixed alternate days, so that a single-chamber vehicle never carries both streams in one trip. This requires a change to route scheduling only, with no capital expenditure, and it addresses the condition recorded by 67 per cent of respondents in this survey. (Owner: ULB operations: share of lanes on alternate-day dry collection)</w:t>
+      </w:r>
+    </w:p>
+    <w:p>
+      <w:pPr/>
+      <w:r>
+        <w:t>Apply enforcement to the mixing actor, and make it conditional on service provision. Issue spot fines under the Solid Waste Management Rules, 2016 primarily against handlers, vendors and commercial establishments that remix segregated streams, rather than against households in lanes where dual bins and labelled vehicles have not been provided. This survey found downstream mixing observed by 87 per cent of respondents while only 19 per cent always segregate at source, which places the majority of the failure downstream of the household. (Owner: ULB enforcement with the ward office: number of mixing incidents recorded at handover, and contamination rate in serviced against unserviced lanes)</w:t>
+      </w:r>
+    </w:p>
+    <w:p>
+      <w:pPr/>
+      <w:r>
+        <w:t>Divert wet waste at source through community composting. Establish community composting units for gated societies and mandatory wet-waste segregation for commercial establishments, and exclude composted wet waste from the daily collection route. Since wet waste exceeds half of all urban generation, this is the only intervention that reduces the dominant tonnage rather than merely sorting it. (Owner: ULB with society management committees: share of wet weight diverted from the collection route)</w:t>
+      </w:r>
+    </w:p>
+    <w:p>
+      <w:pPr/>
+      <w:r>
+        <w:t>Set targets against the conveniently segregable fraction rather than against unverified absolutes. State municipal targets against the World Bank estimate that 15 to 20 per cent of national waste is conveniently segregable at source, and against the CPCB composition range of 30 to 55 per cent compostable and 5 to 15 per cent recyclable, rather than against claimed rates of 90 or 100 per cent that this study has already shown to be unverified. (Owner: MoHUA and urban local bodies: published basis for each target)</w:t>
       </w:r>
     </w:p>
     <w:p>
@@ -11182,6 +11215,42 @@
           <w:rtl w:val="0"/>
         </w:rPr>
         <w:t xml:space="preserve">Open Government Data Platform India: CPCB solid-waste resources. https://www.data.gov.in/</w:t>
+      </w:r>
+    </w:p>
+    <w:p>
+      <w:pPr/>
+      <w:r>
+        <w:t>Comptroller and Auditor General (2024). Report on Solid Waste Management in Urban Local Bodies for the year ended 31 March 2022, Chapter 3: Collection, Segregation, Storage, Transportation and Disposal. https://cag.gov.in/uploads/download_audit_report/2024/8_Chapter-3-Collection,-Segregation,-Storage,-T&amp;DoMSW-067b719e95a5748.53823551.pdf</w:t>
+      </w:r>
+    </w:p>
+    <w:p>
+      <w:pPr/>
+      <w:r>
+        <w:t>World Bank (2005). Improving Municipal Solid Waste Management in India. Washington DC: World Bank. https://documents1.worldbank.org/curated/en/682051468267572634/pdf/425660PUB0Wast12732601OFFICIAL0USE1.pdf</w:t>
+      </w:r>
+    </w:p>
+    <w:p>
+      <w:pPr/>
+      <w:r>
+        <w:t>NITI Aayog (2021). Promoting Behaviour Change for Strengthening Waste Segregation at Source: Policy Guidelines. Government of India. https://www.niti.gov.in/sites/default/files/2021-12/PromotingBehaviourChange-forStrengtheningWasteSegregation-at-Source-PolicyGuidelines.pdf</w:t>
+      </w:r>
+    </w:p>
+    <w:p>
+      <w:pPr/>
+      <w:r>
+        <w:t>South Delhi Municipal Corporation (2017). Segregation of Municipal Solid Waste: twin-bin tricycles to informal waste pickers, dry waste purchased at market value, dhalaos converted to recycling centres. https://cdn.cseindia.org/docs/photogallery/slideshows/12_20171212_Segregation-PPT-of-SDMC.pdf</w:t>
+      </w:r>
+    </w:p>
+    <w:p>
+      <w:pPr/>
+      <w:r>
+        <w:t>Pandey, S. (2014). Overview of Municipal Solid Waste Management in India (CPCB composition ranges: compostable 30-55%, recyclable 5-15%, C&amp;D 40-55%). ICRIER. https://icrier.org/Urbanisation/events/30-5-14/musm_Suneel%20Pandey.pdf</w:t>
+      </w:r>
+    </w:p>
+    <w:p>
+      <w:pPr/>
+      <w:r>
+        <w:t>Press Information Bureau (2016). Solid Waste Management Rules revised after sixteen years: user fees, spot fines for non-segregation, and integration of ragpickers and kabadiwalas assigned to State Governments and self-help groups. https://www.pib.gov.in/newsite/printrelease.aspx?relid=138591</w:t>
       </w:r>
     </w:p>
     <w:p>

</xml_diff>